<commit_message>
Add University of Ghana title page and table of contents to the report
</commit_message>
<xml_diff>
--- a/report/technical_report.docx
+++ b/report/technical_report.docx
@@ -2,17 +2,98 @@
 <file path=word/document.xml><?xml version="1.0" encoding="utf-8"?>
 <w:document xmlns:w="http://schemas.openxmlformats.org/wordprocessingml/2006/main" xmlns:m="http://schemas.openxmlformats.org/officeDocument/2006/math" xmlns:r="http://schemas.openxmlformats.org/officeDocument/2006/relationships" xmlns:o="urn:schemas-microsoft-com:office:office" xmlns:v="urn:schemas-microsoft-com:vml" xmlns:w10="urn:schemas-microsoft-com:office:word" xmlns:a="http://schemas.openxmlformats.org/drawingml/2006/main" xmlns:pic="http://schemas.openxmlformats.org/drawingml/2006/picture" xmlns:wp="http://schemas.openxmlformats.org/drawingml/2006/wordprocessingDrawing">
   <w:body>
-    <w:bookmarkStart w:id="41" w:name="X2131ce6e19914791b41259a4ff198c2cf4580ad"/>
     <w:p>
       <w:pPr>
-        <w:pStyle w:val="Heading1"/>
-      </w:pPr>
-      <w:r>
-        <w:t xml:space="preserve">Comparative Study of Bayesian and Non-Parametric Classification</w:t>
+        <w:pStyle w:val="Title"/>
+      </w:pPr>
+      <w:r>
+        <w:t xml:space="preserve">COMPARATIVE STUDY OF BAYESIAN AND NON-PARAMETRIC CLASSIFICATION</w:t>
       </w:r>
     </w:p>
     <w:p>
       <w:pPr>
+        <w:pStyle w:val="Author"/>
+      </w:pPr>
+      <w:r>
+        <w:t xml:space="preserve">SUBMITTED BY</w:t>
+      </w:r>
+    </w:p>
+    <w:p>
+      <w:pPr>
+        <w:pStyle w:val="Author"/>
+      </w:pPr>
+      <w:r>
+        <w:t xml:space="preserve">Akorlie Edward Tsatsu (22424530)</w:t>
+      </w:r>
+    </w:p>
+    <w:p>
+      <w:pPr>
+        <w:pStyle w:val="Author"/>
+      </w:pPr>
+      <w:r>
+        <w:t xml:space="preserve">PROJECT 1</w:t>
+      </w:r>
+    </w:p>
+    <w:p>
+      <w:pPr>
+        <w:pStyle w:val="Author"/>
+      </w:pPr>
+      <w:r>
+        <w:t xml:space="preserve">DSCD612: Pattern Recognition (3 Credits)</w:t>
+      </w:r>
+    </w:p>
+    <w:p>
+      <w:pPr>
+        <w:pStyle w:val="Author"/>
+      </w:pPr>
+      <w:r>
+        <w:t xml:space="preserve">MPhil/MSc Data Science</w:t>
+      </w:r>
+    </w:p>
+    <w:p>
+      <w:pPr>
+        <w:pStyle w:val="Author"/>
+      </w:pPr>
+      <w:r>
+        <w:t xml:space="preserve">University of Ghana, Legon</w:t>
+      </w:r>
+    </w:p>
+    <w:p>
+      <w:pPr>
+        <w:pStyle w:val="Date"/>
+      </w:pPr>
+      <w:r>
+        <w:t xml:space="preserve">September 2026</w:t>
+      </w:r>
+    </w:p>
+    <w:sdt>
+      <w:sdtPr>
+        <w:docPartObj>
+          <w:docPartGallery w:val="Table of Contents"/>
+          <w:docPartUnique/>
+        </w:docPartObj>
+      </w:sdtPr>
+      <w:sdtContent>
+        <w:p>
+          <w:pPr>
+            <w:pStyle w:val="TOCHeading"/>
+          </w:pPr>
+          <w:r>
+            <w:t xml:space="preserve">Table of Contents</w:t>
+          </w:r>
+        </w:p>
+        <w:p>
+          <w:r>
+            <w:fldChar w:fldCharType="begin" w:dirty="true"/>
+            <w:instrText xml:space="preserve">TOC \o "1-3" \h \z \u</w:instrText>
+            <w:fldChar w:fldCharType="separate"/>
+            <w:fldChar w:fldCharType="end"/>
+          </w:r>
+        </w:p>
+      </w:sdtContent>
+    </w:sdt>
+    <w:p>
+      <w:pPr>
         <w:pStyle w:val="FirstParagraph"/>
       </w:pPr>
       <w:r>
@@ -20,27 +101,56 @@
           <w:b/>
           <w:bCs/>
         </w:rPr>
-        <w:t xml:space="preserve">DSCD612: Pattern Recognition, Project 1</w:t>
-      </w:r>
-      <w:r>
-        <w:t xml:space="preserve"> </w:t>
-      </w:r>
-      <w:r>
-        <w:rPr>
-          <w:b/>
-          <w:bCs/>
-        </w:rPr>
-        <w:t xml:space="preserve">University of Ghana, MPhil/MSc Data Science</w:t>
+        <w:t xml:space="preserve">Live, executable notebook:</w:t>
+      </w:r>
+      <w:r>
+        <w:t xml:space="preserve"> </w:t>
+      </w:r>
+      <w:r>
+        <w:t xml:space="preserve">the full analysis below can be opened and</w:t>
+      </w:r>
+      <w:r>
+        <w:t xml:space="preserve"> </w:t>
+      </w:r>
+      <w:r>
+        <w:t xml:space="preserve">re-run directly, no local setup required:</w:t>
+      </w:r>
+      <w:r>
+        <w:t xml:space="preserve"> </w:t>
+      </w:r>
+      <w:hyperlink r:id="rId9">
+        <w:r>
+          <w:rPr>
+            <w:rStyle w:val="Hyperlink"/>
+          </w:rPr>
+          <w:t xml:space="preserve">Open in Google Colab</w:t>
+        </w:r>
+      </w:hyperlink>
+      <w:r>
+        <w:t xml:space="preserve">.</w:t>
+      </w:r>
+      <w:r>
+        <w:t xml:space="preserve"> </w:t>
+      </w:r>
+      <w:r>
+        <w:t xml:space="preserve">Source code and data:</w:t>
+      </w:r>
+      <w:r>
+        <w:t xml:space="preserve"> </w:t>
+      </w:r>
+      <w:hyperlink r:id="rId10">
+        <w:r>
+          <w:rPr>
+            <w:rStyle w:val="Hyperlink"/>
+          </w:rPr>
+          <w:t xml:space="preserve">GitHub repository</w:t>
+        </w:r>
+      </w:hyperlink>
+      <w:r>
+        <w:t xml:space="preserve">.</w:t>
       </w:r>
     </w:p>
-    <w:p>
-      <w:r>
-        <w:pict>
-          <v:rect style="width:0;height:1.5pt" o:hralign="center" o:hrstd="t" o:hr="t"/>
-        </w:pict>
-      </w:r>
-    </w:p>
-    <w:bookmarkStart w:id="9" w:name="Xb6c37aa9573b1ac52a7a0821a3f75d0e900d9bb"/>
+    <w:bookmarkStart w:id="11" w:name="Xb6c37aa9573b1ac52a7a0821a3f75d0e900d9bb"/>
     <w:p>
       <w:pPr>
         <w:pStyle w:val="Heading2"/>
@@ -666,8 +776,8 @@
         <w:t xml:space="preserve">the 16 + 1 minimum needed to estimate an invertible 16×16 covariance matrix).</w:t>
       </w:r>
     </w:p>
-    <w:bookmarkEnd w:id="9"/>
-    <w:bookmarkStart w:id="16" w:name="exploratory-analysis-and-preprocessing"/>
+    <w:bookmarkEnd w:id="11"/>
+    <w:bookmarkStart w:id="18" w:name="exploratory-analysis-and-preprocessing"/>
     <w:p>
       <w:pPr>
         <w:pStyle w:val="Heading2"/>
@@ -699,18 +809,18 @@
           <wp:inline>
             <wp:extent cx="5334000" cy="3807110"/>
             <wp:effectExtent b="0" l="0" r="0" t="0"/>
-            <wp:docPr descr="Class distribution" title="" id="11" name="Picture"/>
+            <wp:docPr descr="Class distribution" title="" id="13" name="Picture"/>
             <a:graphic>
               <a:graphicData uri="http://schemas.openxmlformats.org/drawingml/2006/picture">
                 <pic:pic>
                   <pic:nvPicPr>
-                    <pic:cNvPr descr="results/figures/class_distribution.png" id="12" name="Picture"/>
+                    <pic:cNvPr descr="results/figures/class_distribution.png" id="14" name="Picture"/>
                     <pic:cNvPicPr>
                       <a:picLocks noChangeArrowheads="1" noChangeAspect="1"/>
                     </pic:cNvPicPr>
                   </pic:nvPicPr>
                   <pic:blipFill>
-                    <a:blip r:embed="rId10"/>
+                    <a:blip r:embed="rId12"/>
                     <a:stretch>
                       <a:fillRect/>
                     </a:stretch>
@@ -796,18 +906,18 @@
           <wp:inline>
             <wp:extent cx="5334000" cy="4725666"/>
             <wp:effectExtent b="0" l="0" r="0" t="0"/>
-            <wp:docPr descr="Correlation heatmap" title="" id="14" name="Picture"/>
+            <wp:docPr descr="Correlation heatmap" title="" id="16" name="Picture"/>
             <a:graphic>
               <a:graphicData uri="http://schemas.openxmlformats.org/drawingml/2006/picture">
                 <pic:pic>
                   <pic:nvPicPr>
-                    <pic:cNvPr descr="results/figures/correlation_heatmap.png" id="15" name="Picture"/>
+                    <pic:cNvPr descr="results/figures/correlation_heatmap.png" id="17" name="Picture"/>
                     <pic:cNvPicPr>
                       <a:picLocks noChangeArrowheads="1" noChangeAspect="1"/>
                     </pic:cNvPicPr>
                   </pic:nvPicPr>
                   <pic:blipFill>
-                    <a:blip r:embed="rId13"/>
+                    <a:blip r:embed="rId15"/>
                     <a:stretch>
                       <a:fillRect/>
                     </a:stretch>
@@ -2051,8 +2161,8 @@
         <w:t xml:space="preserve">the full dataset, avoids leaking test-set statistics into the transform.</w:t>
       </w:r>
     </w:p>
-    <w:bookmarkEnd w:id="16"/>
-    <w:bookmarkStart w:id="17" w:name="feature-representation"/>
+    <w:bookmarkEnd w:id="18"/>
+    <w:bookmarkStart w:id="19" w:name="feature-representation"/>
     <w:p>
       <w:pPr>
         <w:pStyle w:val="Heading2"/>
@@ -2660,8 +2770,8 @@
         <w:t xml:space="preserve">transformation applied is the standardisation described in Section 2.</w:t>
       </w:r>
     </w:p>
-    <w:bookmarkEnd w:id="17"/>
-    <w:bookmarkStart w:id="21" w:name="X663e3a3a7f1576b9f4dbf6ed22821199beedbb4"/>
+    <w:bookmarkEnd w:id="19"/>
+    <w:bookmarkStart w:id="23" w:name="X663e3a3a7f1576b9f4dbf6ed22821199beedbb4"/>
     <w:p>
       <w:pPr>
         <w:pStyle w:val="Heading2"/>
@@ -2670,7 +2780,7 @@
         <w:t xml:space="preserve">4. Mathematical Explanation of the Principal Algorithms</w:t>
       </w:r>
     </w:p>
-    <w:bookmarkStart w:id="18" w:name="sample-mean-and-covariance"/>
+    <w:bookmarkStart w:id="20" w:name="sample-mean-and-covariance"/>
     <w:p>
       <w:pPr>
         <w:pStyle w:val="Heading3"/>
@@ -3316,8 +3426,8 @@
         <w:t xml:space="preserve">.</w:t>
       </w:r>
     </w:p>
-    <w:bookmarkEnd w:id="18"/>
-    <w:bookmarkStart w:id="19" w:name="X71a820b92194441852b9f80ee540660fed7d0c1"/>
+    <w:bookmarkEnd w:id="20"/>
+    <w:bookmarkStart w:id="21" w:name="X71a820b92194441852b9f80ee540660fed7d0c1"/>
     <w:p>
       <w:pPr>
         <w:pStyle w:val="Heading3"/>
@@ -5194,8 +5304,8 @@
         <w:t xml:space="preserve">hyperplane (linear discriminant analysis).</w:t>
       </w:r>
     </w:p>
-    <w:bookmarkEnd w:id="19"/>
-    <w:bookmarkStart w:id="20" w:name="X44394da164e742fa832a96c0c89f3395410626d"/>
+    <w:bookmarkEnd w:id="21"/>
+    <w:bookmarkStart w:id="22" w:name="X44394da164e742fa832a96c0c89f3395410626d"/>
     <w:p>
       <w:pPr>
         <w:pStyle w:val="Heading3"/>
@@ -6177,9 +6287,9 @@
         <w:t xml:space="preserve">dataset.</w:t>
       </w:r>
     </w:p>
-    <w:bookmarkEnd w:id="20"/>
-    <w:bookmarkEnd w:id="21"/>
-    <w:bookmarkStart w:id="22" w:name="python-implementation"/>
+    <w:bookmarkEnd w:id="22"/>
+    <w:bookmarkEnd w:id="23"/>
+    <w:bookmarkStart w:id="24" w:name="python-implementation"/>
     <w:p>
       <w:pPr>
         <w:pStyle w:val="Heading2"/>
@@ -6851,8 +6961,8 @@
         <w:t xml:space="preserve">visualization functions returning valid Matplotlib figures.</w:t>
       </w:r>
     </w:p>
-    <w:bookmarkEnd w:id="22"/>
-    <w:bookmarkStart w:id="23" w:name="experimental-design"/>
+    <w:bookmarkEnd w:id="24"/>
+    <w:bookmarkStart w:id="25" w:name="experimental-design"/>
     <w:p>
       <w:pPr>
         <w:pStyle w:val="Heading2"/>
@@ -7310,8 +7420,8 @@
         <w:t xml:space="preserve">assumptions rather than to different data being used.</w:t>
       </w:r>
     </w:p>
-    <w:bookmarkEnd w:id="23"/>
-    <w:bookmarkStart w:id="24" w:name="quantitative-evaluation-and-comparison"/>
+    <w:bookmarkEnd w:id="25"/>
+    <w:bookmarkStart w:id="26" w:name="quantitative-evaluation-and-comparison"/>
     <w:p>
       <w:pPr>
         <w:pStyle w:val="Heading2"/>
@@ -9289,8 +9399,8 @@
         <w:t xml:space="preserve">Section 8) despite being the smallest class by sample count.</w:t>
       </w:r>
     </w:p>
-    <w:bookmarkEnd w:id="24"/>
-    <w:bookmarkStart w:id="37" w:name="Xa851d98c23ee56d88c622b6479a685ed5768714"/>
+    <w:bookmarkEnd w:id="26"/>
+    <w:bookmarkStart w:id="39" w:name="Xa851d98c23ee56d88c622b6479a685ed5768714"/>
     <w:p>
       <w:pPr>
         <w:pStyle w:val="Heading2"/>
@@ -9308,18 +9418,18 @@
           <wp:inline>
             <wp:extent cx="5334000" cy="4218662"/>
             <wp:effectExtent b="0" l="0" r="0" t="0"/>
-            <wp:docPr descr="PCA scatter" title="" id="26" name="Picture"/>
+            <wp:docPr descr="PCA scatter" title="" id="28" name="Picture"/>
             <a:graphic>
               <a:graphicData uri="http://schemas.openxmlformats.org/drawingml/2006/picture">
                 <pic:pic>
                   <pic:nvPicPr>
-                    <pic:cNvPr descr="results/figures/pca_scatter.png" id="27" name="Picture"/>
+                    <pic:cNvPr descr="results/figures/pca_scatter.png" id="29" name="Picture"/>
                     <pic:cNvPicPr>
                       <a:picLocks noChangeArrowheads="1" noChangeAspect="1"/>
                     </pic:cNvPicPr>
                   </pic:nvPicPr>
                   <pic:blipFill>
-                    <a:blip r:embed="rId25"/>
+                    <a:blip r:embed="rId27"/>
                     <a:stretch>
                       <a:fillRect/>
                     </a:stretch>
@@ -9485,18 +9595,18 @@
           <wp:inline>
             <wp:extent cx="5334000" cy="4053840"/>
             <wp:effectExtent b="0" l="0" r="0" t="0"/>
-            <wp:docPr descr="k-NN accuracy vs k" title="" id="29" name="Picture"/>
+            <wp:docPr descr="k-NN accuracy vs k" title="" id="31" name="Picture"/>
             <a:graphic>
               <a:graphicData uri="http://schemas.openxmlformats.org/drawingml/2006/picture">
                 <pic:pic>
                   <pic:nvPicPr>
-                    <pic:cNvPr descr="results/figures/knn_accuracy_vs_k.png" id="30" name="Picture"/>
+                    <pic:cNvPr descr="results/figures/knn_accuracy_vs_k.png" id="32" name="Picture"/>
                     <pic:cNvPicPr>
                       <a:picLocks noChangeArrowheads="1" noChangeAspect="1"/>
                     </pic:cNvPicPr>
                   </pic:nvPicPr>
                   <pic:blipFill>
-                    <a:blip r:embed="rId28"/>
+                    <a:blip r:embed="rId30"/>
                     <a:stretch>
                       <a:fillRect/>
                     </a:stretch>
@@ -9707,18 +9817,18 @@
           <wp:inline>
             <wp:extent cx="5334000" cy="5083116"/>
             <wp:effectExtent b="0" l="0" r="0" t="0"/>
-            <wp:docPr descr="Bayesian confusion matrix" title="" id="32" name="Picture"/>
+            <wp:docPr descr="Bayesian confusion matrix" title="" id="34" name="Picture"/>
             <a:graphic>
               <a:graphicData uri="http://schemas.openxmlformats.org/drawingml/2006/picture">
                 <pic:pic>
                   <pic:nvPicPr>
-                    <pic:cNvPr descr="results/figures/confusion_matrix_bayesian.png" id="33" name="Picture"/>
+                    <pic:cNvPr descr="results/figures/confusion_matrix_bayesian.png" id="35" name="Picture"/>
                     <pic:cNvPicPr>
                       <a:picLocks noChangeArrowheads="1" noChangeAspect="1"/>
                     </pic:cNvPicPr>
                   </pic:nvPicPr>
                   <pic:blipFill>
-                    <a:blip r:embed="rId31"/>
+                    <a:blip r:embed="rId33"/>
                     <a:stretch>
                       <a:fillRect/>
                     </a:stretch>
@@ -9804,18 +9914,18 @@
           <wp:inline>
             <wp:extent cx="5334000" cy="5083116"/>
             <wp:effectExtent b="0" l="0" r="0" t="0"/>
-            <wp:docPr descr="k-NN (best config) confusion matrix" title="" id="35" name="Picture"/>
+            <wp:docPr descr="k-NN (best config) confusion matrix" title="" id="37" name="Picture"/>
             <a:graphic>
               <a:graphicData uri="http://schemas.openxmlformats.org/drawingml/2006/picture">
                 <pic:pic>
                   <pic:nvPicPr>
-                    <pic:cNvPr descr="results/figures/confusion_matrix_knn_best.png" id="36" name="Picture"/>
+                    <pic:cNvPr descr="results/figures/confusion_matrix_knn_best.png" id="38" name="Picture"/>
                     <pic:cNvPicPr>
                       <a:picLocks noChangeArrowheads="1" noChangeAspect="1"/>
                     </pic:cNvPicPr>
                   </pic:nvPicPr>
                   <pic:blipFill>
-                    <a:blip r:embed="rId34"/>
+                    <a:blip r:embed="rId36"/>
                     <a:stretch>
                       <a:fillRect/>
                     </a:stretch>
@@ -9924,8 +10034,8 @@
         <w:t xml:space="preserve">class.</w:t>
       </w:r>
     </w:p>
-    <w:bookmarkEnd w:id="37"/>
-    <w:bookmarkStart w:id="38" w:name="critical-discussion-of-limitations"/>
+    <w:bookmarkEnd w:id="39"/>
+    <w:bookmarkStart w:id="40" w:name="critical-discussion-of-limitations"/>
     <w:p>
       <w:pPr>
         <w:pStyle w:val="Heading2"/>
@@ -10752,8 +10862,8 @@
         <w:t xml:space="preserve">(k-NN).</w:t>
       </w:r>
     </w:p>
-    <w:bookmarkEnd w:id="38"/>
-    <w:bookmarkStart w:id="39" w:name="central-research-question"/>
+    <w:bookmarkEnd w:id="40"/>
+    <w:bookmarkStart w:id="41" w:name="central-research-question"/>
     <w:p>
       <w:pPr>
         <w:pStyle w:val="Heading2"/>
@@ -11337,8 +11447,8 @@
         <w:t xml:space="preserve">(or become actively misleading) when it does not.</w:t>
       </w:r>
     </w:p>
-    <w:bookmarkEnd w:id="39"/>
-    <w:bookmarkStart w:id="40" w:name="references"/>
+    <w:bookmarkEnd w:id="41"/>
+    <w:bookmarkStart w:id="42" w:name="references"/>
     <w:p>
       <w:pPr>
         <w:pStyle w:val="Heading2"/>
@@ -11508,8 +11618,7 @@
         <w:t xml:space="preserve">metrics only, not for the classifiers themselves; see Section 5.)</w:t>
       </w:r>
     </w:p>
-    <w:bookmarkEnd w:id="40"/>
-    <w:bookmarkEnd w:id="41"/>
+    <w:bookmarkEnd w:id="42"/>
     <w:sectPr>
       <w:footnotePr>
         <w:numRestart w:val="eachSect"/>

</xml_diff>

<commit_message>
Make Colab/GitHub links visibly clickable in the report
</commit_message>
<xml_diff>
--- a/report/technical_report.docx
+++ b/report/technical_report.docx
@@ -113,7 +113,7 @@
         <w:t xml:space="preserve"> </w:t>
       </w:r>
       <w:r>
-        <w:t xml:space="preserve">re-run directly, no local setup required:</w:t>
+        <w:t xml:space="preserve">re-run directly, no local setup required, at</w:t>
       </w:r>
       <w:r>
         <w:t xml:space="preserve"> </w:t>
@@ -123,7 +123,7 @@
           <w:rPr>
             <w:rStyle w:val="Hyperlink"/>
           </w:rPr>
-          <w:t xml:space="preserve">Open in Google Colab</w:t>
+          <w:t xml:space="preserve">https://colab.research.google.com/github/edwardtsatsu/dscd612-pattern-recognition-project1/blob/main/notebooks/project1_bayesian_vs_knn.ipynb</w:t>
         </w:r>
       </w:hyperlink>
       <w:r>
@@ -143,7 +143,7 @@
           <w:rPr>
             <w:rStyle w:val="Hyperlink"/>
           </w:rPr>
-          <w:t xml:space="preserve">GitHub repository</w:t>
+          <w:t xml:space="preserve">https://github.com/edwardtsatsu/dscd612-pattern-recognition-project1</w:t>
         </w:r>
       </w:hyperlink>
       <w:r>

</xml_diff>

<commit_message>
Use reliable single-line clickable links in the report
</commit_message>
<xml_diff>
--- a/report/technical_report.docx
+++ b/report/technical_report.docx
@@ -113,7 +113,45 @@
         <w:t xml:space="preserve"> </w:t>
       </w:r>
       <w:r>
-        <w:t xml:space="preserve">re-run directly, no local setup required, at</w:t>
+        <w:t xml:space="preserve">re-run directly, no local setup required:</w:t>
+      </w:r>
+      <w:r>
+        <w:t xml:space="preserve"> </w:t>
+      </w:r>
+      <w:hyperlink r:id="rId9">
+        <w:r>
+          <w:rPr>
+            <w:rStyle w:val="Hyperlink"/>
+            <w:b/>
+            <w:bCs/>
+          </w:rPr>
+          <w:t xml:space="preserve">click here to open in Google</w:t>
+        </w:r>
+        <w:r>
+          <w:rPr>
+            <w:rStyle w:val="Hyperlink"/>
+            <w:b/>
+            <w:bCs/>
+          </w:rPr>
+          <w:t xml:space="preserve"> </w:t>
+        </w:r>
+        <w:r>
+          <w:rPr>
+            <w:rStyle w:val="Hyperlink"/>
+            <w:b/>
+            <w:bCs/>
+          </w:rPr>
+          <w:t xml:space="preserve">Colab</w:t>
+        </w:r>
+      </w:hyperlink>
+      <w:r>
+        <w:t xml:space="preserve">.</w:t>
+      </w:r>
+      <w:r>
+        <w:t xml:space="preserve"> </w:t>
+      </w:r>
+      <w:r>
+        <w:t xml:space="preserve">If that does not open for you, copy this address into a browser:</w:t>
       </w:r>
       <w:r>
         <w:t xml:space="preserve"> </w:t>
@@ -126,6 +164,47 @@
           <w:t xml:space="preserve">https://colab.research.google.com/github/edwardtsatsu/dscd612-pattern-recognition-project1/blob/main/notebooks/project1_bayesian_vs_knn.ipynb</w:t>
         </w:r>
       </w:hyperlink>
+    </w:p>
+    <w:p>
+      <w:pPr>
+        <w:pStyle w:val="BodyText"/>
+      </w:pPr>
+      <w:r>
+        <w:rPr>
+          <w:b/>
+          <w:bCs/>
+        </w:rPr>
+        <w:t xml:space="preserve">Source code and data:</w:t>
+      </w:r>
+      <w:r>
+        <w:t xml:space="preserve"> </w:t>
+      </w:r>
+      <w:hyperlink r:id="rId10">
+        <w:r>
+          <w:rPr>
+            <w:rStyle w:val="Hyperlink"/>
+            <w:b/>
+            <w:bCs/>
+          </w:rPr>
+          <w:t xml:space="preserve">click here for the GitHub</w:t>
+        </w:r>
+        <w:r>
+          <w:rPr>
+            <w:rStyle w:val="Hyperlink"/>
+            <w:b/>
+            <w:bCs/>
+          </w:rPr>
+          <w:t xml:space="preserve"> </w:t>
+        </w:r>
+        <w:r>
+          <w:rPr>
+            <w:rStyle w:val="Hyperlink"/>
+            <w:b/>
+            <w:bCs/>
+          </w:rPr>
+          <w:t xml:space="preserve">repository</w:t>
+        </w:r>
+      </w:hyperlink>
       <w:r>
         <w:t xml:space="preserve">.</w:t>
       </w:r>
@@ -133,7 +212,7 @@
         <w:t xml:space="preserve"> </w:t>
       </w:r>
       <w:r>
-        <w:t xml:space="preserve">Source code and data:</w:t>
+        <w:t xml:space="preserve">Full address:</w:t>
       </w:r>
       <w:r>
         <w:t xml:space="preserve"> </w:t>
@@ -146,9 +225,6 @@
           <w:t xml:space="preserve">https://github.com/edwardtsatsu/dscd612-pattern-recognition-project1</w:t>
         </w:r>
       </w:hyperlink>
-      <w:r>
-        <w:t xml:space="preserve">.</w:t>
-      </w:r>
     </w:p>
     <w:bookmarkStart w:id="11" w:name="Xb6c37aa9573b1ac52a7a0821a3f75d0e900d9bb"/>
     <w:p>

</xml_diff>

<commit_message>
Fix overflowing UCI dataset URL in report
</commit_message>
<xml_diff>
--- a/report/technical_report.docx
+++ b/report/technical_report.docx
@@ -226,7 +226,7 @@
         </w:r>
       </w:hyperlink>
     </w:p>
-    <w:bookmarkStart w:id="11" w:name="Xb6c37aa9573b1ac52a7a0821a3f75d0e900d9bb"/>
+    <w:bookmarkStart w:id="12" w:name="Xb6c37aa9573b1ac52a7a0821a3f75d0e900d9bb"/>
     <w:p>
       <w:pPr>
         <w:pStyle w:val="Heading2"/>
@@ -436,12 +436,14 @@
       <w:r>
         <w:t xml:space="preserve">(</w:t>
       </w:r>
-      <w:r>
-        <w:rPr>
-          <w:rStyle w:val="VerbatimChar"/>
-        </w:rPr>
-        <w:t xml:space="preserve">https://archive.ics.uci.edu/dataset/602/dry+bean+dataset</w:t>
-      </w:r>
+      <w:hyperlink r:id="rId11">
+        <w:r>
+          <w:rPr>
+            <w:rStyle w:val="Hyperlink"/>
+          </w:rPr>
+          <w:t xml:space="preserve">https://archive.ics.uci.edu/dataset/602/dry+bean+dataset</w:t>
+        </w:r>
+      </w:hyperlink>
       <w:r>
         <w:t xml:space="preserve">). It consists of</w:t>
       </w:r>
@@ -852,8 +854,8 @@
         <w:t xml:space="preserve">the 16 + 1 minimum needed to estimate an invertible 16×16 covariance matrix).</w:t>
       </w:r>
     </w:p>
-    <w:bookmarkEnd w:id="11"/>
-    <w:bookmarkStart w:id="18" w:name="exploratory-analysis-and-preprocessing"/>
+    <w:bookmarkEnd w:id="12"/>
+    <w:bookmarkStart w:id="19" w:name="exploratory-analysis-and-preprocessing"/>
     <w:p>
       <w:pPr>
         <w:pStyle w:val="Heading2"/>
@@ -885,18 +887,18 @@
           <wp:inline>
             <wp:extent cx="5334000" cy="3807110"/>
             <wp:effectExtent b="0" l="0" r="0" t="0"/>
-            <wp:docPr descr="Class distribution" title="" id="13" name="Picture"/>
+            <wp:docPr descr="Class distribution" title="" id="14" name="Picture"/>
             <a:graphic>
               <a:graphicData uri="http://schemas.openxmlformats.org/drawingml/2006/picture">
                 <pic:pic>
                   <pic:nvPicPr>
-                    <pic:cNvPr descr="results/figures/class_distribution.png" id="14" name="Picture"/>
+                    <pic:cNvPr descr="results/figures/class_distribution.png" id="15" name="Picture"/>
                     <pic:cNvPicPr>
                       <a:picLocks noChangeArrowheads="1" noChangeAspect="1"/>
                     </pic:cNvPicPr>
                   </pic:nvPicPr>
                   <pic:blipFill>
-                    <a:blip r:embed="rId12"/>
+                    <a:blip r:embed="rId13"/>
                     <a:stretch>
                       <a:fillRect/>
                     </a:stretch>
@@ -982,18 +984,18 @@
           <wp:inline>
             <wp:extent cx="5334000" cy="4725666"/>
             <wp:effectExtent b="0" l="0" r="0" t="0"/>
-            <wp:docPr descr="Correlation heatmap" title="" id="16" name="Picture"/>
+            <wp:docPr descr="Correlation heatmap" title="" id="17" name="Picture"/>
             <a:graphic>
               <a:graphicData uri="http://schemas.openxmlformats.org/drawingml/2006/picture">
                 <pic:pic>
                   <pic:nvPicPr>
-                    <pic:cNvPr descr="results/figures/correlation_heatmap.png" id="17" name="Picture"/>
+                    <pic:cNvPr descr="results/figures/correlation_heatmap.png" id="18" name="Picture"/>
                     <pic:cNvPicPr>
                       <a:picLocks noChangeArrowheads="1" noChangeAspect="1"/>
                     </pic:cNvPicPr>
                   </pic:nvPicPr>
                   <pic:blipFill>
-                    <a:blip r:embed="rId15"/>
+                    <a:blip r:embed="rId16"/>
                     <a:stretch>
                       <a:fillRect/>
                     </a:stretch>
@@ -2237,8 +2239,8 @@
         <w:t xml:space="preserve">the full dataset, avoids leaking test-set statistics into the transform.</w:t>
       </w:r>
     </w:p>
-    <w:bookmarkEnd w:id="18"/>
-    <w:bookmarkStart w:id="19" w:name="feature-representation"/>
+    <w:bookmarkEnd w:id="19"/>
+    <w:bookmarkStart w:id="20" w:name="feature-representation"/>
     <w:p>
       <w:pPr>
         <w:pStyle w:val="Heading2"/>
@@ -2846,8 +2848,8 @@
         <w:t xml:space="preserve">transformation applied is the standardisation described in Section 2.</w:t>
       </w:r>
     </w:p>
-    <w:bookmarkEnd w:id="19"/>
-    <w:bookmarkStart w:id="23" w:name="X663e3a3a7f1576b9f4dbf6ed22821199beedbb4"/>
+    <w:bookmarkEnd w:id="20"/>
+    <w:bookmarkStart w:id="24" w:name="X663e3a3a7f1576b9f4dbf6ed22821199beedbb4"/>
     <w:p>
       <w:pPr>
         <w:pStyle w:val="Heading2"/>
@@ -2856,7 +2858,7 @@
         <w:t xml:space="preserve">4. Mathematical Explanation of the Principal Algorithms</w:t>
       </w:r>
     </w:p>
-    <w:bookmarkStart w:id="20" w:name="sample-mean-and-covariance"/>
+    <w:bookmarkStart w:id="21" w:name="sample-mean-and-covariance"/>
     <w:p>
       <w:pPr>
         <w:pStyle w:val="Heading3"/>
@@ -3502,8 +3504,8 @@
         <w:t xml:space="preserve">.</w:t>
       </w:r>
     </w:p>
-    <w:bookmarkEnd w:id="20"/>
-    <w:bookmarkStart w:id="21" w:name="X71a820b92194441852b9f80ee540660fed7d0c1"/>
+    <w:bookmarkEnd w:id="21"/>
+    <w:bookmarkStart w:id="22" w:name="X71a820b92194441852b9f80ee540660fed7d0c1"/>
     <w:p>
       <w:pPr>
         <w:pStyle w:val="Heading3"/>
@@ -5380,8 +5382,8 @@
         <w:t xml:space="preserve">hyperplane (linear discriminant analysis).</w:t>
       </w:r>
     </w:p>
-    <w:bookmarkEnd w:id="21"/>
-    <w:bookmarkStart w:id="22" w:name="X44394da164e742fa832a96c0c89f3395410626d"/>
+    <w:bookmarkEnd w:id="22"/>
+    <w:bookmarkStart w:id="23" w:name="X44394da164e742fa832a96c0c89f3395410626d"/>
     <w:p>
       <w:pPr>
         <w:pStyle w:val="Heading3"/>
@@ -6363,9 +6365,9 @@
         <w:t xml:space="preserve">dataset.</w:t>
       </w:r>
     </w:p>
-    <w:bookmarkEnd w:id="22"/>
     <w:bookmarkEnd w:id="23"/>
-    <w:bookmarkStart w:id="24" w:name="python-implementation"/>
+    <w:bookmarkEnd w:id="24"/>
+    <w:bookmarkStart w:id="25" w:name="python-implementation"/>
     <w:p>
       <w:pPr>
         <w:pStyle w:val="Heading2"/>
@@ -7037,8 +7039,8 @@
         <w:t xml:space="preserve">visualization functions returning valid Matplotlib figures.</w:t>
       </w:r>
     </w:p>
-    <w:bookmarkEnd w:id="24"/>
-    <w:bookmarkStart w:id="25" w:name="experimental-design"/>
+    <w:bookmarkEnd w:id="25"/>
+    <w:bookmarkStart w:id="26" w:name="experimental-design"/>
     <w:p>
       <w:pPr>
         <w:pStyle w:val="Heading2"/>
@@ -7496,8 +7498,8 @@
         <w:t xml:space="preserve">assumptions rather than to different data being used.</w:t>
       </w:r>
     </w:p>
-    <w:bookmarkEnd w:id="25"/>
-    <w:bookmarkStart w:id="26" w:name="quantitative-evaluation-and-comparison"/>
+    <w:bookmarkEnd w:id="26"/>
+    <w:bookmarkStart w:id="27" w:name="quantitative-evaluation-and-comparison"/>
     <w:p>
       <w:pPr>
         <w:pStyle w:val="Heading2"/>
@@ -9475,8 +9477,8 @@
         <w:t xml:space="preserve">Section 8) despite being the smallest class by sample count.</w:t>
       </w:r>
     </w:p>
-    <w:bookmarkEnd w:id="26"/>
-    <w:bookmarkStart w:id="39" w:name="Xa851d98c23ee56d88c622b6479a685ed5768714"/>
+    <w:bookmarkEnd w:id="27"/>
+    <w:bookmarkStart w:id="40" w:name="Xa851d98c23ee56d88c622b6479a685ed5768714"/>
     <w:p>
       <w:pPr>
         <w:pStyle w:val="Heading2"/>
@@ -9494,18 +9496,18 @@
           <wp:inline>
             <wp:extent cx="5334000" cy="4218662"/>
             <wp:effectExtent b="0" l="0" r="0" t="0"/>
-            <wp:docPr descr="PCA scatter" title="" id="28" name="Picture"/>
+            <wp:docPr descr="PCA scatter" title="" id="29" name="Picture"/>
             <a:graphic>
               <a:graphicData uri="http://schemas.openxmlformats.org/drawingml/2006/picture">
                 <pic:pic>
                   <pic:nvPicPr>
-                    <pic:cNvPr descr="results/figures/pca_scatter.png" id="29" name="Picture"/>
+                    <pic:cNvPr descr="results/figures/pca_scatter.png" id="30" name="Picture"/>
                     <pic:cNvPicPr>
                       <a:picLocks noChangeArrowheads="1" noChangeAspect="1"/>
                     </pic:cNvPicPr>
                   </pic:nvPicPr>
                   <pic:blipFill>
-                    <a:blip r:embed="rId27"/>
+                    <a:blip r:embed="rId28"/>
                     <a:stretch>
                       <a:fillRect/>
                     </a:stretch>
@@ -9671,18 +9673,18 @@
           <wp:inline>
             <wp:extent cx="5334000" cy="4053840"/>
             <wp:effectExtent b="0" l="0" r="0" t="0"/>
-            <wp:docPr descr="k-NN accuracy vs k" title="" id="31" name="Picture"/>
+            <wp:docPr descr="k-NN accuracy vs k" title="" id="32" name="Picture"/>
             <a:graphic>
               <a:graphicData uri="http://schemas.openxmlformats.org/drawingml/2006/picture">
                 <pic:pic>
                   <pic:nvPicPr>
-                    <pic:cNvPr descr="results/figures/knn_accuracy_vs_k.png" id="32" name="Picture"/>
+                    <pic:cNvPr descr="results/figures/knn_accuracy_vs_k.png" id="33" name="Picture"/>
                     <pic:cNvPicPr>
                       <a:picLocks noChangeArrowheads="1" noChangeAspect="1"/>
                     </pic:cNvPicPr>
                   </pic:nvPicPr>
                   <pic:blipFill>
-                    <a:blip r:embed="rId30"/>
+                    <a:blip r:embed="rId31"/>
                     <a:stretch>
                       <a:fillRect/>
                     </a:stretch>
@@ -9893,18 +9895,18 @@
           <wp:inline>
             <wp:extent cx="5334000" cy="5083116"/>
             <wp:effectExtent b="0" l="0" r="0" t="0"/>
-            <wp:docPr descr="Bayesian confusion matrix" title="" id="34" name="Picture"/>
+            <wp:docPr descr="Bayesian confusion matrix" title="" id="35" name="Picture"/>
             <a:graphic>
               <a:graphicData uri="http://schemas.openxmlformats.org/drawingml/2006/picture">
                 <pic:pic>
                   <pic:nvPicPr>
-                    <pic:cNvPr descr="results/figures/confusion_matrix_bayesian.png" id="35" name="Picture"/>
+                    <pic:cNvPr descr="results/figures/confusion_matrix_bayesian.png" id="36" name="Picture"/>
                     <pic:cNvPicPr>
                       <a:picLocks noChangeArrowheads="1" noChangeAspect="1"/>
                     </pic:cNvPicPr>
                   </pic:nvPicPr>
                   <pic:blipFill>
-                    <a:blip r:embed="rId33"/>
+                    <a:blip r:embed="rId34"/>
                     <a:stretch>
                       <a:fillRect/>
                     </a:stretch>
@@ -9990,18 +9992,18 @@
           <wp:inline>
             <wp:extent cx="5334000" cy="5083116"/>
             <wp:effectExtent b="0" l="0" r="0" t="0"/>
-            <wp:docPr descr="k-NN (best config) confusion matrix" title="" id="37" name="Picture"/>
+            <wp:docPr descr="k-NN (best config) confusion matrix" title="" id="38" name="Picture"/>
             <a:graphic>
               <a:graphicData uri="http://schemas.openxmlformats.org/drawingml/2006/picture">
                 <pic:pic>
                   <pic:nvPicPr>
-                    <pic:cNvPr descr="results/figures/confusion_matrix_knn_best.png" id="38" name="Picture"/>
+                    <pic:cNvPr descr="results/figures/confusion_matrix_knn_best.png" id="39" name="Picture"/>
                     <pic:cNvPicPr>
                       <a:picLocks noChangeArrowheads="1" noChangeAspect="1"/>
                     </pic:cNvPicPr>
                   </pic:nvPicPr>
                   <pic:blipFill>
-                    <a:blip r:embed="rId36"/>
+                    <a:blip r:embed="rId37"/>
                     <a:stretch>
                       <a:fillRect/>
                     </a:stretch>
@@ -10110,8 +10112,8 @@
         <w:t xml:space="preserve">class.</w:t>
       </w:r>
     </w:p>
-    <w:bookmarkEnd w:id="39"/>
-    <w:bookmarkStart w:id="40" w:name="critical-discussion-of-limitations"/>
+    <w:bookmarkEnd w:id="40"/>
+    <w:bookmarkStart w:id="41" w:name="critical-discussion-of-limitations"/>
     <w:p>
       <w:pPr>
         <w:pStyle w:val="Heading2"/>
@@ -10938,8 +10940,8 @@
         <w:t xml:space="preserve">(k-NN).</w:t>
       </w:r>
     </w:p>
-    <w:bookmarkEnd w:id="40"/>
-    <w:bookmarkStart w:id="41" w:name="central-research-question"/>
+    <w:bookmarkEnd w:id="41"/>
+    <w:bookmarkStart w:id="42" w:name="central-research-question"/>
     <w:p>
       <w:pPr>
         <w:pStyle w:val="Heading2"/>
@@ -11523,8 +11525,8 @@
         <w:t xml:space="preserve">(or become actively misleading) when it does not.</w:t>
       </w:r>
     </w:p>
-    <w:bookmarkEnd w:id="41"/>
-    <w:bookmarkStart w:id="42" w:name="references"/>
+    <w:bookmarkEnd w:id="42"/>
+    <w:bookmarkStart w:id="43" w:name="references"/>
     <w:p>
       <w:pPr>
         <w:pStyle w:val="Heading2"/>
@@ -11610,12 +11612,14 @@
       <w:r>
         <w:t xml:space="preserve"> </w:t>
       </w:r>
-      <w:r>
-        <w:rPr>
-          <w:rStyle w:val="VerbatimChar"/>
-        </w:rPr>
-        <w:t xml:space="preserve">https://archive.ics.uci.edu/dataset/602/dry+bean+dataset</w:t>
-      </w:r>
+      <w:hyperlink r:id="rId11">
+        <w:r>
+          <w:rPr>
+            <w:rStyle w:val="Hyperlink"/>
+          </w:rPr>
+          <w:t xml:space="preserve">https://archive.ics.uci.edu/dataset/602/dry+bean+dataset</w:t>
+        </w:r>
+      </w:hyperlink>
     </w:p>
     <w:p>
       <w:pPr>
@@ -11694,7 +11698,7 @@
         <w:t xml:space="preserve">metrics only, not for the classifiers themselves; see Section 5.)</w:t>
       </w:r>
     </w:p>
-    <w:bookmarkEnd w:id="42"/>
+    <w:bookmarkEnd w:id="43"/>
     <w:sectPr>
       <w:footnotePr>
         <w:numRestart w:val="eachSect"/>

</xml_diff>

<commit_message>
Open up spacing between title-page groups, matching the template
</commit_message>
<xml_diff>
--- a/report/technical_report.docx
+++ b/report/technical_report.docx
@@ -2,70 +2,6 @@
 <file path=word/document.xml><?xml version="1.0" encoding="utf-8"?>
 <w:document xmlns:w="http://schemas.openxmlformats.org/wordprocessingml/2006/main" xmlns:m="http://schemas.openxmlformats.org/officeDocument/2006/math" xmlns:r="http://schemas.openxmlformats.org/officeDocument/2006/relationships" xmlns:o="urn:schemas-microsoft-com:office:office" xmlns:v="urn:schemas-microsoft-com:vml" xmlns:w10="urn:schemas-microsoft-com:office:word" xmlns:a="http://schemas.openxmlformats.org/drawingml/2006/main" xmlns:pic="http://schemas.openxmlformats.org/drawingml/2006/picture" xmlns:wp="http://schemas.openxmlformats.org/drawingml/2006/wordprocessingDrawing">
   <w:body>
-    <w:p>
-      <w:pPr>
-        <w:pStyle w:val="Title"/>
-      </w:pPr>
-      <w:r>
-        <w:t xml:space="preserve">COMPARATIVE STUDY OF BAYESIAN AND NON-PARAMETRIC CLASSIFICATION</w:t>
-      </w:r>
-    </w:p>
-    <w:p>
-      <w:pPr>
-        <w:pStyle w:val="Author"/>
-      </w:pPr>
-      <w:r>
-        <w:t xml:space="preserve">SUBMITTED BY</w:t>
-      </w:r>
-    </w:p>
-    <w:p>
-      <w:pPr>
-        <w:pStyle w:val="Author"/>
-      </w:pPr>
-      <w:r>
-        <w:t xml:space="preserve">Akorlie Edward Tsatsu (22424530)</w:t>
-      </w:r>
-    </w:p>
-    <w:p>
-      <w:pPr>
-        <w:pStyle w:val="Author"/>
-      </w:pPr>
-      <w:r>
-        <w:t xml:space="preserve">PROJECT 1</w:t>
-      </w:r>
-    </w:p>
-    <w:p>
-      <w:pPr>
-        <w:pStyle w:val="Author"/>
-      </w:pPr>
-      <w:r>
-        <w:t xml:space="preserve">DSCD612: Pattern Recognition (3 Credits)</w:t>
-      </w:r>
-    </w:p>
-    <w:p>
-      <w:pPr>
-        <w:pStyle w:val="Author"/>
-      </w:pPr>
-      <w:r>
-        <w:t xml:space="preserve">MPhil/MSc Data Science</w:t>
-      </w:r>
-    </w:p>
-    <w:p>
-      <w:pPr>
-        <w:pStyle w:val="Author"/>
-      </w:pPr>
-      <w:r>
-        <w:t xml:space="preserve">University of Ghana, Legon</w:t>
-      </w:r>
-    </w:p>
-    <w:p>
-      <w:pPr>
-        <w:pStyle w:val="Date"/>
-      </w:pPr>
-      <w:r>
-        <w:t xml:space="preserve">September 2026</w:t>
-      </w:r>
-    </w:p>
     <w:sdt>
       <w:sdtPr>
         <w:docPartObj>
@@ -97,10 +33,121 @@
         <w:pStyle w:val="FirstParagraph"/>
       </w:pPr>
       <w:r>
+        <w:drawing>
+          <wp:inline>
+            <wp:extent cx="1280160" cy="1423998"/>
+            <wp:effectExtent b="0" l="0" r="0" t="0"/>
+            <wp:docPr descr="" title="" id="10" name="Picture"/>
+            <a:graphic>
+              <a:graphicData uri="http://schemas.openxmlformats.org/drawingml/2006/picture">
+                <pic:pic>
+                  <pic:nvPicPr>
+                    <pic:cNvPr descr="report/assets/ug_crest.png" id="11" name="Picture"/>
+                    <pic:cNvPicPr>
+                      <a:picLocks noChangeArrowheads="1" noChangeAspect="1"/>
+                    </pic:cNvPicPr>
+                  </pic:nvPicPr>
+                  <pic:blipFill>
+                    <a:blip r:embed="rId9"/>
+                    <a:stretch>
+                      <a:fillRect/>
+                    </a:stretch>
+                  </pic:blipFill>
+                  <pic:spPr bwMode="auto">
+                    <a:xfrm>
+                      <a:off x="0" y="0"/>
+                      <a:ext cx="1280160" cy="1423998"/>
+                    </a:xfrm>
+                    <a:prstGeom prst="rect">
+                      <a:avLst/>
+                    </a:prstGeom>
+                    <a:noFill/>
+                    <a:ln w="9525">
+                      <a:noFill/>
+                      <a:headEnd/>
+                      <a:tailEnd/>
+                    </a:ln>
+                  </pic:spPr>
+                </pic:pic>
+              </a:graphicData>
+            </a:graphic>
+          </wp:inline>
+        </w:drawing>
+      </w:r>
+    </w:p>
+    <w:p>
+      <w:pPr>
+        <w:pStyle w:val="BodyText"/>
+      </w:pPr>
+      <w:r>
         <w:rPr>
           <w:b/>
           <w:bCs/>
         </w:rPr>
+        <w:t xml:space="preserve">COMPARATIVE STUDY OF BAYESIAN AND NON-PARAMETRIC CLASSIFICATION</w:t>
+      </w:r>
+    </w:p>
+    <w:p>
+      <w:pPr>
+        <w:pStyle w:val="BodyText"/>
+      </w:pPr>
+      <w:r>
+        <w:t xml:space="preserve">SUBMITTED BY</w:t>
+      </w:r>
+    </w:p>
+    <w:p>
+      <w:pPr>
+        <w:pStyle w:val="BodyText"/>
+      </w:pPr>
+      <w:r>
+        <w:t xml:space="preserve">Akorlie Edward Tsatsu (22424530)</w:t>
+      </w:r>
+    </w:p>
+    <w:p>
+      <w:pPr>
+        <w:pStyle w:val="BodyText"/>
+      </w:pPr>
+      <w:r>
+        <w:t xml:space="preserve">PROJECT 1</w:t>
+      </w:r>
+      <w:r>
+        <w:br/>
+      </w:r>
+      <w:r>
+        <w:t xml:space="preserve">DSCD612: Pattern Recognition (3 Credits)</w:t>
+      </w:r>
+      <w:r>
+        <w:br/>
+      </w:r>
+      <w:r>
+        <w:t xml:space="preserve">MPhil/MSc Data Science</w:t>
+      </w:r>
+    </w:p>
+    <w:p>
+      <w:pPr>
+        <w:pStyle w:val="BodyText"/>
+      </w:pPr>
+      <w:r>
+        <w:t xml:space="preserve">University of Ghana, Legon</w:t>
+      </w:r>
+    </w:p>
+    <w:p>
+      <w:pPr>
+        <w:pStyle w:val="BodyText"/>
+      </w:pPr>
+      <w:r>
+        <w:t xml:space="preserve">September 2026</w:t>
+      </w:r>
+    </w:p>
+    <w:p>
+      <w:pPr>
+        <w:pStyle w:val="BodyText"/>
+      </w:pPr>
+      <w:r>
+        <w:rPr>
+          <w:b/>
+          <w:bCs/>
+        </w:rPr>
         <w:t xml:space="preserve">Live, executable notebook:</w:t>
       </w:r>
       <w:r>
@@ -118,7 +165,7 @@
       <w:r>
         <w:t xml:space="preserve"> </w:t>
       </w:r>
-      <w:hyperlink r:id="rId9">
+      <w:hyperlink r:id="rId12">
         <w:r>
           <w:rPr>
             <w:rStyle w:val="Hyperlink"/>
@@ -156,7 +203,7 @@
       <w:r>
         <w:t xml:space="preserve"> </w:t>
       </w:r>
-      <w:hyperlink r:id="rId9">
+      <w:hyperlink r:id="rId12">
         <w:r>
           <w:rPr>
             <w:rStyle w:val="Hyperlink"/>
@@ -179,7 +226,7 @@
       <w:r>
         <w:t xml:space="preserve"> </w:t>
       </w:r>
-      <w:hyperlink r:id="rId10">
+      <w:hyperlink r:id="rId13">
         <w:r>
           <w:rPr>
             <w:rStyle w:val="Hyperlink"/>
@@ -217,7 +264,7 @@
       <w:r>
         <w:t xml:space="preserve"> </w:t>
       </w:r>
-      <w:hyperlink r:id="rId10">
+      <w:hyperlink r:id="rId13">
         <w:r>
           <w:rPr>
             <w:rStyle w:val="Hyperlink"/>
@@ -226,7 +273,7 @@
         </w:r>
       </w:hyperlink>
     </w:p>
-    <w:bookmarkStart w:id="12" w:name="Xb6c37aa9573b1ac52a7a0821a3f75d0e900d9bb"/>
+    <w:bookmarkStart w:id="15" w:name="Xb6c37aa9573b1ac52a7a0821a3f75d0e900d9bb"/>
     <w:p>
       <w:pPr>
         <w:pStyle w:val="Heading2"/>
@@ -436,7 +483,7 @@
       <w:r>
         <w:t xml:space="preserve">(</w:t>
       </w:r>
-      <w:hyperlink r:id="rId11">
+      <w:hyperlink r:id="rId14">
         <w:r>
           <w:rPr>
             <w:rStyle w:val="Hyperlink"/>
@@ -854,8 +901,8 @@
         <w:t xml:space="preserve">the 16 + 1 minimum needed to estimate an invertible 16×16 covariance matrix).</w:t>
       </w:r>
     </w:p>
-    <w:bookmarkEnd w:id="12"/>
-    <w:bookmarkStart w:id="19" w:name="exploratory-analysis-and-preprocessing"/>
+    <w:bookmarkEnd w:id="15"/>
+    <w:bookmarkStart w:id="22" w:name="exploratory-analysis-and-preprocessing"/>
     <w:p>
       <w:pPr>
         <w:pStyle w:val="Heading2"/>
@@ -887,18 +934,18 @@
           <wp:inline>
             <wp:extent cx="5334000" cy="3807110"/>
             <wp:effectExtent b="0" l="0" r="0" t="0"/>
-            <wp:docPr descr="Class distribution" title="" id="14" name="Picture"/>
+            <wp:docPr descr="Class distribution" title="" id="17" name="Picture"/>
             <a:graphic>
               <a:graphicData uri="http://schemas.openxmlformats.org/drawingml/2006/picture">
                 <pic:pic>
                   <pic:nvPicPr>
-                    <pic:cNvPr descr="results/figures/class_distribution.png" id="15" name="Picture"/>
+                    <pic:cNvPr descr="results/figures/class_distribution.png" id="18" name="Picture"/>
                     <pic:cNvPicPr>
                       <a:picLocks noChangeArrowheads="1" noChangeAspect="1"/>
                     </pic:cNvPicPr>
                   </pic:nvPicPr>
                   <pic:blipFill>
-                    <a:blip r:embed="rId13"/>
+                    <a:blip r:embed="rId16"/>
                     <a:stretch>
                       <a:fillRect/>
                     </a:stretch>
@@ -984,18 +1031,18 @@
           <wp:inline>
             <wp:extent cx="5334000" cy="4725666"/>
             <wp:effectExtent b="0" l="0" r="0" t="0"/>
-            <wp:docPr descr="Correlation heatmap" title="" id="17" name="Picture"/>
+            <wp:docPr descr="Correlation heatmap" title="" id="20" name="Picture"/>
             <a:graphic>
               <a:graphicData uri="http://schemas.openxmlformats.org/drawingml/2006/picture">
                 <pic:pic>
                   <pic:nvPicPr>
-                    <pic:cNvPr descr="results/figures/correlation_heatmap.png" id="18" name="Picture"/>
+                    <pic:cNvPr descr="results/figures/correlation_heatmap.png" id="21" name="Picture"/>
                     <pic:cNvPicPr>
                       <a:picLocks noChangeArrowheads="1" noChangeAspect="1"/>
                     </pic:cNvPicPr>
                   </pic:nvPicPr>
                   <pic:blipFill>
-                    <a:blip r:embed="rId16"/>
+                    <a:blip r:embed="rId19"/>
                     <a:stretch>
                       <a:fillRect/>
                     </a:stretch>
@@ -2239,8 +2286,8 @@
         <w:t xml:space="preserve">the full dataset, avoids leaking test-set statistics into the transform.</w:t>
       </w:r>
     </w:p>
-    <w:bookmarkEnd w:id="19"/>
-    <w:bookmarkStart w:id="20" w:name="feature-representation"/>
+    <w:bookmarkEnd w:id="22"/>
+    <w:bookmarkStart w:id="23" w:name="feature-representation"/>
     <w:p>
       <w:pPr>
         <w:pStyle w:val="Heading2"/>
@@ -2848,8 +2895,8 @@
         <w:t xml:space="preserve">transformation applied is the standardisation described in Section 2.</w:t>
       </w:r>
     </w:p>
-    <w:bookmarkEnd w:id="20"/>
-    <w:bookmarkStart w:id="24" w:name="X663e3a3a7f1576b9f4dbf6ed22821199beedbb4"/>
+    <w:bookmarkEnd w:id="23"/>
+    <w:bookmarkStart w:id="27" w:name="X663e3a3a7f1576b9f4dbf6ed22821199beedbb4"/>
     <w:p>
       <w:pPr>
         <w:pStyle w:val="Heading2"/>
@@ -2858,7 +2905,7 @@
         <w:t xml:space="preserve">4. Mathematical Explanation of the Principal Algorithms</w:t>
       </w:r>
     </w:p>
-    <w:bookmarkStart w:id="21" w:name="sample-mean-and-covariance"/>
+    <w:bookmarkStart w:id="24" w:name="sample-mean-and-covariance"/>
     <w:p>
       <w:pPr>
         <w:pStyle w:val="Heading3"/>
@@ -3504,8 +3551,8 @@
         <w:t xml:space="preserve">.</w:t>
       </w:r>
     </w:p>
-    <w:bookmarkEnd w:id="21"/>
-    <w:bookmarkStart w:id="22" w:name="X71a820b92194441852b9f80ee540660fed7d0c1"/>
+    <w:bookmarkEnd w:id="24"/>
+    <w:bookmarkStart w:id="25" w:name="X71a820b92194441852b9f80ee540660fed7d0c1"/>
     <w:p>
       <w:pPr>
         <w:pStyle w:val="Heading3"/>
@@ -5382,8 +5429,8 @@
         <w:t xml:space="preserve">hyperplane (linear discriminant analysis).</w:t>
       </w:r>
     </w:p>
-    <w:bookmarkEnd w:id="22"/>
-    <w:bookmarkStart w:id="23" w:name="X44394da164e742fa832a96c0c89f3395410626d"/>
+    <w:bookmarkEnd w:id="25"/>
+    <w:bookmarkStart w:id="26" w:name="X44394da164e742fa832a96c0c89f3395410626d"/>
     <w:p>
       <w:pPr>
         <w:pStyle w:val="Heading3"/>
@@ -6365,9 +6412,9 @@
         <w:t xml:space="preserve">dataset.</w:t>
       </w:r>
     </w:p>
-    <w:bookmarkEnd w:id="23"/>
-    <w:bookmarkEnd w:id="24"/>
-    <w:bookmarkStart w:id="25" w:name="python-implementation"/>
+    <w:bookmarkEnd w:id="26"/>
+    <w:bookmarkEnd w:id="27"/>
+    <w:bookmarkStart w:id="28" w:name="python-implementation"/>
     <w:p>
       <w:pPr>
         <w:pStyle w:val="Heading2"/>
@@ -7039,8 +7086,8 @@
         <w:t xml:space="preserve">visualization functions returning valid Matplotlib figures.</w:t>
       </w:r>
     </w:p>
-    <w:bookmarkEnd w:id="25"/>
-    <w:bookmarkStart w:id="26" w:name="experimental-design"/>
+    <w:bookmarkEnd w:id="28"/>
+    <w:bookmarkStart w:id="29" w:name="experimental-design"/>
     <w:p>
       <w:pPr>
         <w:pStyle w:val="Heading2"/>
@@ -7498,8 +7545,8 @@
         <w:t xml:space="preserve">assumptions rather than to different data being used.</w:t>
       </w:r>
     </w:p>
-    <w:bookmarkEnd w:id="26"/>
-    <w:bookmarkStart w:id="27" w:name="quantitative-evaluation-and-comparison"/>
+    <w:bookmarkEnd w:id="29"/>
+    <w:bookmarkStart w:id="30" w:name="quantitative-evaluation-and-comparison"/>
     <w:p>
       <w:pPr>
         <w:pStyle w:val="Heading2"/>
@@ -9477,8 +9524,8 @@
         <w:t xml:space="preserve">Section 8) despite being the smallest class by sample count.</w:t>
       </w:r>
     </w:p>
-    <w:bookmarkEnd w:id="27"/>
-    <w:bookmarkStart w:id="40" w:name="Xa851d98c23ee56d88c622b6479a685ed5768714"/>
+    <w:bookmarkEnd w:id="30"/>
+    <w:bookmarkStart w:id="43" w:name="Xa851d98c23ee56d88c622b6479a685ed5768714"/>
     <w:p>
       <w:pPr>
         <w:pStyle w:val="Heading2"/>
@@ -9496,18 +9543,18 @@
           <wp:inline>
             <wp:extent cx="5334000" cy="4218662"/>
             <wp:effectExtent b="0" l="0" r="0" t="0"/>
-            <wp:docPr descr="PCA scatter" title="" id="29" name="Picture"/>
+            <wp:docPr descr="PCA scatter" title="" id="32" name="Picture"/>
             <a:graphic>
               <a:graphicData uri="http://schemas.openxmlformats.org/drawingml/2006/picture">
                 <pic:pic>
                   <pic:nvPicPr>
-                    <pic:cNvPr descr="results/figures/pca_scatter.png" id="30" name="Picture"/>
+                    <pic:cNvPr descr="results/figures/pca_scatter.png" id="33" name="Picture"/>
                     <pic:cNvPicPr>
                       <a:picLocks noChangeArrowheads="1" noChangeAspect="1"/>
                     </pic:cNvPicPr>
                   </pic:nvPicPr>
                   <pic:blipFill>
-                    <a:blip r:embed="rId28"/>
+                    <a:blip r:embed="rId31"/>
                     <a:stretch>
                       <a:fillRect/>
                     </a:stretch>
@@ -9673,18 +9720,18 @@
           <wp:inline>
             <wp:extent cx="5334000" cy="4053840"/>
             <wp:effectExtent b="0" l="0" r="0" t="0"/>
-            <wp:docPr descr="k-NN accuracy vs k" title="" id="32" name="Picture"/>
+            <wp:docPr descr="k-NN accuracy vs k" title="" id="35" name="Picture"/>
             <a:graphic>
               <a:graphicData uri="http://schemas.openxmlformats.org/drawingml/2006/picture">
                 <pic:pic>
                   <pic:nvPicPr>
-                    <pic:cNvPr descr="results/figures/knn_accuracy_vs_k.png" id="33" name="Picture"/>
+                    <pic:cNvPr descr="results/figures/knn_accuracy_vs_k.png" id="36" name="Picture"/>
                     <pic:cNvPicPr>
                       <a:picLocks noChangeArrowheads="1" noChangeAspect="1"/>
                     </pic:cNvPicPr>
                   </pic:nvPicPr>
                   <pic:blipFill>
-                    <a:blip r:embed="rId31"/>
+                    <a:blip r:embed="rId34"/>
                     <a:stretch>
                       <a:fillRect/>
                     </a:stretch>
@@ -9895,109 +9942,12 @@
           <wp:inline>
             <wp:extent cx="5334000" cy="5083116"/>
             <wp:effectExtent b="0" l="0" r="0" t="0"/>
-            <wp:docPr descr="Bayesian confusion matrix" title="" id="35" name="Picture"/>
+            <wp:docPr descr="Bayesian confusion matrix" title="" id="38" name="Picture"/>
             <a:graphic>
               <a:graphicData uri="http://schemas.openxmlformats.org/drawingml/2006/picture">
                 <pic:pic>
                   <pic:nvPicPr>
-                    <pic:cNvPr descr="results/figures/confusion_matrix_bayesian.png" id="36" name="Picture"/>
-                    <pic:cNvPicPr>
-                      <a:picLocks noChangeArrowheads="1" noChangeAspect="1"/>
-                    </pic:cNvPicPr>
-                  </pic:nvPicPr>
-                  <pic:blipFill>
-                    <a:blip r:embed="rId34"/>
-                    <a:stretch>
-                      <a:fillRect/>
-                    </a:stretch>
-                  </pic:blipFill>
-                  <pic:spPr bwMode="auto">
-                    <a:xfrm>
-                      <a:off x="0" y="0"/>
-                      <a:ext cx="5334000" cy="5083116"/>
-                    </a:xfrm>
-                    <a:prstGeom prst="rect">
-                      <a:avLst/>
-                    </a:prstGeom>
-                    <a:noFill/>
-                    <a:ln w="9525">
-                      <a:noFill/>
-                      <a:headEnd/>
-                      <a:tailEnd/>
-                    </a:ln>
-                  </pic:spPr>
-                </pic:pic>
-              </a:graphicData>
-            </a:graphic>
-          </wp:inline>
-        </w:drawing>
-      </w:r>
-    </w:p>
-    <w:p>
-      <w:pPr>
-        <w:pStyle w:val="ImageCaption"/>
-      </w:pPr>
-      <w:r>
-        <w:t xml:space="preserve">Bayesian confusion matrix</w:t>
-      </w:r>
-    </w:p>
-    <w:p>
-      <w:pPr>
-        <w:pStyle w:val="BodyText"/>
-      </w:pPr>
-      <w:r>
-        <w:rPr>
-          <w:i/>
-          <w:iCs/>
-        </w:rPr>
-        <w:t xml:space="preserve">Figure 5: Bayesian classifier confusion matrix.</w:t>
-      </w:r>
-      <w:r>
-        <w:t xml:space="preserve"> </w:t>
-      </w:r>
-      <w:r>
-        <w:t xml:space="preserve">The largest off-diagonal</w:t>
-      </w:r>
-      <w:r>
-        <w:t xml:space="preserve"> </w:t>
-      </w:r>
-      <w:r>
-        <w:t xml:space="preserve">mass sits at (DERMASON, SIRA) = 142 and (SIRA, DERMASON) = 38, with a smaller</w:t>
-      </w:r>
-      <w:r>
-        <w:t xml:space="preserve"> </w:t>
-      </w:r>
-      <w:r>
-        <w:t xml:space="preserve">concentration at (BARBUNYA, CALI) = 33. Every other class pair has single- or</w:t>
-      </w:r>
-      <w:r>
-        <w:t xml:space="preserve"> </w:t>
-      </w:r>
-      <w:r>
-        <w:t xml:space="preserve">low-double-digit confusion counts, and BOMBAY’s row and column are entirely</w:t>
-      </w:r>
-      <w:r>
-        <w:t xml:space="preserve"> </w:t>
-      </w:r>
-      <w:r>
-        <w:t xml:space="preserve">zero off the diagonal.</w:t>
-      </w:r>
-    </w:p>
-    <w:p>
-      <w:pPr>
-        <w:pStyle w:val="CaptionedFigure"/>
-      </w:pPr>
-      <w:r>
-        <w:drawing>
-          <wp:inline>
-            <wp:extent cx="5334000" cy="5083116"/>
-            <wp:effectExtent b="0" l="0" r="0" t="0"/>
-            <wp:docPr descr="k-NN (best config) confusion matrix" title="" id="38" name="Picture"/>
-            <a:graphic>
-              <a:graphicData uri="http://schemas.openxmlformats.org/drawingml/2006/picture">
-                <pic:pic>
-                  <pic:nvPicPr>
-                    <pic:cNvPr descr="results/figures/confusion_matrix_knn_best.png" id="39" name="Picture"/>
+                    <pic:cNvPr descr="results/figures/confusion_matrix_bayesian.png" id="39" name="Picture"/>
                     <pic:cNvPicPr>
                       <a:picLocks noChangeArrowheads="1" noChangeAspect="1"/>
                     </pic:cNvPicPr>
@@ -10035,7 +9985,7 @@
         <w:pStyle w:val="ImageCaption"/>
       </w:pPr>
       <w:r>
-        <w:t xml:space="preserve">k-NN (best config) confusion matrix</w:t>
+        <w:t xml:space="preserve">Bayesian confusion matrix</w:t>
       </w:r>
     </w:p>
     <w:p>
@@ -10047,20 +9997,117 @@
           <w:i/>
           <w:iCs/>
         </w:rPr>
-        <w:t xml:space="preserve">Figure 6: Confusion matrix for the best k-NN configuration (Euclidean,</w:t>
-      </w:r>
+        <w:t xml:space="preserve">Figure 5: Bayesian classifier confusion matrix.</w:t>
+      </w:r>
+      <w:r>
+        <w:t xml:space="preserve"> </w:t>
+      </w:r>
+      <w:r>
+        <w:t xml:space="preserve">The largest off-diagonal</w:t>
+      </w:r>
+      <w:r>
+        <w:t xml:space="preserve"> </w:t>
+      </w:r>
+      <w:r>
+        <w:t xml:space="preserve">mass sits at (DERMASON, SIRA) = 142 and (SIRA, DERMASON) = 38, with a smaller</w:t>
+      </w:r>
+      <w:r>
+        <w:t xml:space="preserve"> </w:t>
+      </w:r>
+      <w:r>
+        <w:t xml:space="preserve">concentration at (BARBUNYA, CALI) = 33. Every other class pair has single- or</w:t>
+      </w:r>
+      <w:r>
+        <w:t xml:space="preserve"> </w:t>
+      </w:r>
+      <w:r>
+        <w:t xml:space="preserve">low-double-digit confusion counts, and BOMBAY’s row and column are entirely</w:t>
+      </w:r>
+      <w:r>
+        <w:t xml:space="preserve"> </w:t>
+      </w:r>
+      <w:r>
+        <w:t xml:space="preserve">zero off the diagonal.</w:t>
+      </w:r>
+    </w:p>
+    <w:p>
+      <w:pPr>
+        <w:pStyle w:val="CaptionedFigure"/>
+      </w:pPr>
+      <w:r>
+        <w:drawing>
+          <wp:inline>
+            <wp:extent cx="5334000" cy="5083116"/>
+            <wp:effectExtent b="0" l="0" r="0" t="0"/>
+            <wp:docPr descr="k-NN (best config) confusion matrix" title="" id="41" name="Picture"/>
+            <a:graphic>
+              <a:graphicData uri="http://schemas.openxmlformats.org/drawingml/2006/picture">
+                <pic:pic>
+                  <pic:nvPicPr>
+                    <pic:cNvPr descr="results/figures/confusion_matrix_knn_best.png" id="42" name="Picture"/>
+                    <pic:cNvPicPr>
+                      <a:picLocks noChangeArrowheads="1" noChangeAspect="1"/>
+                    </pic:cNvPicPr>
+                  </pic:nvPicPr>
+                  <pic:blipFill>
+                    <a:blip r:embed="rId40"/>
+                    <a:stretch>
+                      <a:fillRect/>
+                    </a:stretch>
+                  </pic:blipFill>
+                  <pic:spPr bwMode="auto">
+                    <a:xfrm>
+                      <a:off x="0" y="0"/>
+                      <a:ext cx="5334000" cy="5083116"/>
+                    </a:xfrm>
+                    <a:prstGeom prst="rect">
+                      <a:avLst/>
+                    </a:prstGeom>
+                    <a:noFill/>
+                    <a:ln w="9525">
+                      <a:noFill/>
+                      <a:headEnd/>
+                      <a:tailEnd/>
+                    </a:ln>
+                  </pic:spPr>
+                </pic:pic>
+              </a:graphicData>
+            </a:graphic>
+          </wp:inline>
+        </w:drawing>
+      </w:r>
+    </w:p>
+    <w:p>
+      <w:pPr>
+        <w:pStyle w:val="ImageCaption"/>
+      </w:pPr>
+      <w:r>
+        <w:t xml:space="preserve">k-NN (best config) confusion matrix</w:t>
+      </w:r>
+    </w:p>
+    <w:p>
+      <w:pPr>
+        <w:pStyle w:val="BodyText"/>
+      </w:pPr>
       <w:r>
         <w:rPr>
           <w:i/>
           <w:iCs/>
         </w:rPr>
-        <w:t xml:space="preserve"> </w:t>
+        <w:t xml:space="preserve">Figure 6: Confusion matrix for the best k-NN configuration (Euclidean,</w:t>
       </w:r>
       <w:r>
         <w:rPr>
           <w:i/>
           <w:iCs/>
         </w:rPr>
+        <w:t xml:space="preserve"> </w:t>
+      </w:r>
+      <w:r>
+        <w:rPr>
+          <w:i/>
+          <w:iCs/>
+        </w:rPr>
         <w:t xml:space="preserve">k=9).</w:t>
       </w:r>
       <w:r>
@@ -10112,8 +10159,8 @@
         <w:t xml:space="preserve">class.</w:t>
       </w:r>
     </w:p>
-    <w:bookmarkEnd w:id="40"/>
-    <w:bookmarkStart w:id="41" w:name="critical-discussion-of-limitations"/>
+    <w:bookmarkEnd w:id="43"/>
+    <w:bookmarkStart w:id="44" w:name="critical-discussion-of-limitations"/>
     <w:p>
       <w:pPr>
         <w:pStyle w:val="Heading2"/>
@@ -10940,8 +10987,8 @@
         <w:t xml:space="preserve">(k-NN).</w:t>
       </w:r>
     </w:p>
-    <w:bookmarkEnd w:id="41"/>
-    <w:bookmarkStart w:id="42" w:name="central-research-question"/>
+    <w:bookmarkEnd w:id="44"/>
+    <w:bookmarkStart w:id="45" w:name="central-research-question"/>
     <w:p>
       <w:pPr>
         <w:pStyle w:val="Heading2"/>
@@ -11525,8 +11572,8 @@
         <w:t xml:space="preserve">(or become actively misleading) when it does not.</w:t>
       </w:r>
     </w:p>
-    <w:bookmarkEnd w:id="42"/>
-    <w:bookmarkStart w:id="43" w:name="references"/>
+    <w:bookmarkEnd w:id="45"/>
+    <w:bookmarkStart w:id="46" w:name="references"/>
     <w:p>
       <w:pPr>
         <w:pStyle w:val="Heading2"/>
@@ -11612,7 +11659,7 @@
       <w:r>
         <w:t xml:space="preserve"> </w:t>
       </w:r>
-      <w:hyperlink r:id="rId11">
+      <w:hyperlink r:id="rId14">
         <w:r>
           <w:rPr>
             <w:rStyle w:val="Hyperlink"/>
@@ -11698,7 +11745,7 @@
         <w:t xml:space="preserve">metrics only, not for the classifiers themselves; see Section 5.)</w:t>
       </w:r>
     </w:p>
-    <w:bookmarkEnd w:id="43"/>
+    <w:bookmarkEnd w:id="46"/>
     <w:sectPr>
       <w:footnotePr>
         <w:numRestart w:val="eachSect"/>

</xml_diff>